<commit_message>
chore: sistem performans optimizasyonu - resource limitleri ve veri işleme hızı
</commit_message>
<xml_diff>
--- a/Proje_Raporu.docx
+++ b/Proje_Raporu.docx
@@ -47,9 +47,15 @@
       </w:r>
       <w:r>
         <w:tab/>
+        <w:t>Tarih: 19.05.2026</w:t>
+      </w:r>
+    </w:p>
+    <w:p>
+      <w:r>
+        <w:t xml:space="preserve">Github Repo Linki: </w:t>
       </w:r>
       <w:r>
-        <w:t>Tarih: 19.05.2026</w:t>
+        <w:t>https://github.com/semagllclkk/data-middleware</w:t>
       </w:r>
     </w:p>
     <w:p>
@@ -251,6 +257,7 @@
           </w:tcPr>
           <w:p>
             <w:r>
+              <w:lastRenderedPageBreak/>
               <w:t>2</w:t>
             </w:r>
           </w:p>
@@ -283,7 +290,6 @@
           </w:tcPr>
           <w:p>
             <w:r>
-              <w:lastRenderedPageBreak/>
               <w:t>3</w:t>
             </w:r>
           </w:p>

</xml_diff>